<commit_message>
Junction current row now reports the shipped 2-seed CSV (-0.1823 -> -0.2400, -0.0577, 0/2)
Also: crossing_audit.py argparse fixed so --out/--algo/--distances register, and
results/crossing_audit_block.csv now backs Table 4 (101 blocked -> 81 turns, 202
open -> 0). Sensitivity section removed earlier because its short-hold numbers were
never measured.
</commit_message>
<xml_diff>
--- a/report/RailTech-A3-Report.docx
+++ b/report/RailTech-A3-Report.docx
@@ -270,7 +270,7 @@
         <w:spacing w:after="120"/>
       </w:pPr>
       <w:r>
-        <w:t>This report asks whether a learned policy can beat a schedule-following controller when a track becomes unavailable. Two Flatland scenarios are built from the October 2026 TfNSW GTFS feed: a four-track Central-Strathfield corridor with 52 scheduled movements and the Granville-Harris Park junction with 126. The contribution is as much methodological as empirical. A train-borne disruption layer fires only when a train reaches the chosen cell, so a policy that reroutes early can make the incident vanish: measured on held-out seeds, a rerouting checkpoint triggered 0 of 2 failures and its delayed score was identical to the clean episode. The corridor therefore uses an exogenous blockage: a cell's rail transitions are removed for 400 steps at a seed-drawn time, so both arms face the same cells at the same steps. Under that regime, and across all three algorithms, only the warm-started PPO learns to change track: it improves the metric from -0.0662 to -0.0005, a paired gain of +0.0657 on 30 held-out seeds (30 of 30, p &lt; 1e-4) with every train completing, and it takes no crossing at all on a clean network. A2C drifts back to the forward reflex and DQN parks half the fleet. The junction remains a loss whose failure mode changed with the observation: the selected checkpoint now dispatches and jams (-0.2400, 59 of 126 trains) instead of parking (-0.0251, 0 of 126), and it still finishes behind the scripted route follower (-0.1841, 126 of 126), because the metric charges a cancellation less than a jammed dispatch.</w:t>
+        <w:t>This report asks whether a learned policy can beat a schedule-following controller when a track becomes unavailable. Two Flatland scenarios are built from the October 2026 TfNSW GTFS feed: a four-track Central-Strathfield corridor with 52 scheduled movements and the Granville-Harris Park junction with 126. The contribution is as much methodological as empirical. A train-borne disruption layer fires only when a train reaches the chosen cell, so a policy that reroutes early can make the incident vanish: measured on held-out seeds, a rerouting checkpoint triggered 0 of 2 failures and its delayed score was identical to the clean episode. The corridor therefore uses an exogenous blockage: a cell's rail transitions are removed for 400 steps at a seed-drawn time, so both arms face the same cells at the same steps. Under that regime, and across all three algorithms, only the warm-started PPO learns to change track: it improves the metric from -0.0662 to -0.0005, a paired gain of +0.0657 on 30 held-out seeds (30 of 30, p &lt; 1e-4) with every train completing, and it takes no crossing at all on a clean network. A2C drifts back to the forward reflex and DQN parks half the fleet. The junction remains a loss whose failure mode changed with the observation: the selected checkpoint now dispatches and jams (-0.2400, with 59 of 126 trains completing) instead of parking (-0.0251, 0 of 126), and it still finishes behind the scripted route follower (-0.1823, 126 of 126), because the metric charges a cancellation less than a jammed dispatch.</w:t>
       </w:r>
     </w:p>
     <w:p>
@@ -388,7 +388,7 @@
         <w:spacing w:after="120"/>
       </w:pPr>
       <w:r>
-        <w:t>The workflow runs in six stages, each with a defined input and output (Figure 1). The dashed arrow is deliberate: every change to the observation, reward or disruption regime was re-validated by re-running the same paired evaluation, so the report only contains numbers produced by the final configuration.</w:t>
+        <w:t>The workflow runs in seven stages, each with a defined input and output (Figure 1); the first two, service extraction and pre-processing, are described together below. The dashed arrow is deliberate: every change to the observation, reward or disruption regime was re-validated by re-running the same paired evaluation, so the report only contains numbers produced by the final configuration.</w:t>
       </w:r>
     </w:p>
     <w:p>
@@ -486,7 +486,7 @@
         <w:spacing w:after="60"/>
       </w:pPr>
       <w:r>
-        <w:t>Checkpoint selection: every 400k steps the policy is scored on unseen seeds (9001 to 9004) and the checkpoint is chosen by completion first, then score.</w:t>
+        <w:t>Checkpoint selection: PPO is scored every 100k steps on unseen seeds 9001 to 9004 (thirteen evaluations in the shipped curve); A2C and DQN every 400k steps on two seeds and the checkpoint is chosen by completion first, then score.</w:t>
       </w:r>
     </w:p>
     <w:p>
@@ -511,7 +511,7 @@
         <w:spacing w:after="120"/>
       </w:pPr>
       <w:r>
-        <w:t>The notebook is both the deliverable and the assembly point. It installs the dependencies, defines the scenarios, the observation builder, the environment factory, the baseline, the training loop and the evaluator, and imports the shared modules in scripts/ instead of duplicating them, so the notebook, the training scripts and the reported tables cannot drift apart. Eighteen scripts ship; Appendix A maps each to its responsibility, and anything else named in an earlier version of this project is in attic/ and is not on a live path.</w:t>
+        <w:t>The notebook is both the deliverable and the assembly point. It installs the dependencies, defines the scenarios, the observation builder, the environment factory, the baseline, the training loop and the evaluator, and imports the shared modules in scripts/ instead of duplicating them, so the notebook, the training scripts and the reported tables cannot drift apart in the sense that matters: one environment definition, one observation, one regime, one evaluator. Rendered frames are drawn with make_env while evaluation uses make_parallel_env, so a rendered score is indicative and every reported number comes from eval_pair. Twenty scripts ship; Appendix A maps the modules that matter to their responsibilities, and nothing outside scripts/ is on a live path.</w:t>
       </w:r>
     </w:p>
     <w:p>
@@ -681,7 +681,7 @@
         <w:spacing w:after="120"/>
       </w:pPr>
       <w:r>
-        <w:t>The exogenous design. On the corridor a blockage removes a cell's rail transitions outright at a seed-drawn step and restores them after 400 steps, so it exists whether or not a train goes near it. Two are drawn per episode, one per direction, from the cells just past each commit crossover, and the pool spans both rows of each switchable pair: a blockage on up_local just past Central catches a train that changed track at Burwood to dodge a blockage on up_sub. Activation is deferred while a cell is occupied, because removing the transitions under a standing train would strand it permanently. Both arms therefore face identical cells at identical steps, which is what makes the comparison paired.</w:t>
+        <w:t>The exogenous design. On the corridor a blockage removes a cell's rail transitions outright at a seed-drawn step and restores them after 400 steps, so it exists whether or not a train goes near it. Two are drawn per episode, one per direction, from the cells just past each commit crossover; the pool spans both up rows (2 and 4) and the down-local row (5), because the down-suburban row carries no commit crossover. A blockage on up_local just past Central catches a train that changed track at Burwood to dodge a blockage on up_sub. Activation is deferred while a cell is occupied, because removing the transitions under a standing train would strand it permanently. Both arms therefore face identical cells at identical steps, which is what makes the comparison paired.</w:t>
       </w:r>
     </w:p>
     <w:p>
@@ -689,7 +689,7 @@
         <w:spacing w:after="120"/>
       </w:pPr>
       <w:r>
-        <w:t>Duration is the lever that makes crossing pay. The detour between the two up tracks costs two cells, so a blockage shorter than that is not worth avoiding. The shipped regime holds a cell for 400 steps, about 40 per cent of an episode; Section 3.5 reports the opposite extreme, 30 blockages of 22 steps, where the advantage collapses to +0.001.</w:t>
+        <w:t>Duration is the lever that makes crossing pay. The detour between the two up tracks costs two cells, so a blockage shorter than that is not worth avoiding. The shipped regime holds a cell for 400 steps, about 40 per cent of an episode, which is the regime the reported arm was trained and evaluated on.</w:t>
       </w:r>
     </w:p>
     <w:p>
@@ -697,7 +697,7 @@
         <w:spacing w:after="120"/>
       </w:pPr>
       <w:r>
-        <w:t>The junction keeps a train-borne regime. It has no pair of parallel tracks, so an exogenous blockage would have no alternative route to measure. It uses three 220-step failures inside the running line, never on a station cell, direction-balanced, with durations fixed so that every episode is late.</w:t>
+        <w:t>The junction keeps a train-borne regime. It has no pair of parallel tracks, so an exogenous blockage would have no alternative route to measure. It uses three 220-step failures inside the running line, never on a station cell, with durations fixed so that every episode is late.</w:t>
       </w:r>
     </w:p>
     <w:p>
@@ -713,7 +713,7 @@
         <w:spacing w:after="120"/>
       </w:pPr>
       <w:r>
-        <w:t>The regime and the policy are CPU-bound. Flatland steps the fleet in Python and the tree observation with its predictor is the cost, so the GPU is not the lever: measured on the same budget, 52k timesteps took 207 s on CPU and 216 s with the policy on an RTX 3080. Worker processes do not help either; this PettingZoo stack hangs under SubprocVecEnv. What the measurements do show is where the wall clock goes: a marginal training rate of about 1600 to 1900 agent-steps per second, and roughly 173 s for a four-episode evaluation, so the evaluator, not the network, dominates. The shipped notebook and all figures in this report were executed on an aarch64 Oracle relay (2 vCPU, 11 GB, Python 3.11.17, torch 2.14.1, flatland 4.3.0, SB3 2.9.0), which is also the host of record for the project; the eleven tests and a training-and-render smoke test pass there.</w:t>
+        <w:t>The regime and the policy are CPU-bound. Flatland steps the fleet in Python and the tree observation with its predictor is the cost, so the GPU is not the lever: measured on the same budget, 52k timesteps took 207 s on CPU and 216 s with the policy on an RTX 3080. Worker processes do not help either; this PettingZoo stack hangs under SubprocVecEnv. What the measurements do show is where the wall clock goes: with 104 agent slots per step, 52k timesteps is about 5.4 M agent-steps in 207 s, and a four-episode evaluation costs roughly 173 s, so the evaluator, not the network, dominates. The shipped notebook and all figures in this report were executed on an aarch64 Oracle relay (2 vCPU, 11 GB, Python 3.11.17, torch 2.14.1, flatland 4.3.0, SB3 2.9.0), which is also the host of record for the project; the eleven tests and a training-and-render smoke test pass there.</w:t>
       </w:r>
     </w:p>
     <w:p>
@@ -1412,7 +1412,7 @@
         <w:spacing w:after="120"/>
       </w:pPr>
       <w:r>
-        <w:t>The score is the assessment metric normalised to [-1, 0]. Each train's cost is capped at one episode, summed over 52 trains and divided by the number of agents and the episode budget. A second statistic, delay_all, charges every agent its arrival minus its scheduled arrival, using the episode end for a train that never arrives, so a collapsed policy cannot look punctual by dropping unfinished trains from a survivors-only mean.</w:t>
+        <w:t>The score is the assessment metric normalised to [-1, 0]. Each train's cost is capped at one episode, summed over all agents and divided by the number of agents and the episode budget. A second statistic, delay_all, charges every agent its arrival minus its scheduled arrival, using the episode end for a train that never arrives, so a collapsed policy cannot look punctual by dropping unfinished trains from a survivors-only mean.</w:t>
       </w:r>
     </w:p>
     <w:p>
@@ -2336,7 +2336,7 @@
           <w:color w:val="404040"/>
           <w:sz w:val="18"/>
         </w:rPr>
-        <w:t>Table 3: Corridor training outcome per arm. Internal score and completion come from the selection seeds; the rendered episode is seed 3001, the same episode shown in Figure 4.</w:t>
+        <w:t>Table 3: Corridor training outcome per arm. Internal score and completion come from the selection seeds; the rendered column is seed 3001 as drawn by the renderer, which uses make_env rather than the evaluator's make_parallel_env, so it is indicative - the reported numbers are always the paired ones in Table 2.</w:t>
       </w:r>
     </w:p>
     <w:p>
@@ -2519,7 +2519,7 @@
         <w:spacing w:after="120"/>
       </w:pPr>
       <w:r>
-        <w:t>A score gain alone does not prove that the policy changes track for the right reason, since a policy that crosses at every crossover also gains on this map: both same-direction tracks accept the same platforms. The audit counts the decisions themselves. For every agent-step standing on a commit crossover it records whether a blocked cell lay ahead on that train's own row before its next waypoint, and whether the agent chose a lateral action.</w:t>
+        <w:t>A score gain alone does not prove that the policy changes track for the right reason, since a policy that crosses at every crossover also gains on this map: both same-direction tracks accept the same platforms. The audit counts the decisions themselves. For every agent-step standing on a commit crossover it records whether a blocked cell lay ahead on that train's own row within 60 cells ahead, and whether the agent chose a lateral action. The per-crossover table is shipped as results/crossing_audit_block.csv by scripts/crossing_audit.py.</w:t>
       </w:r>
     </w:p>
     <w:tbl>
@@ -3559,7 +3559,7 @@
           <w:color w:val="404040"/>
           <w:sz w:val="18"/>
         </w:rPr>
-        <w:t>Table 4: Per-crossover decision audit over seeds 3000 and 3001. Blocked means an impassable cell ahead on the train's own row before its next waypoint. The 20 missed turns at (5,59) are hazards beyond the next waypoint, correctly ignored.</w:t>
+        <w:t>Table 4: Per-crossover decision audit over seeds 3000 and 3001. Blocked means an impassable cell ahead on the train's own row within 60 cells. The 20 missed turns at (5,59) are hazards beyond the next waypoint, correctly ignored.</w:t>
       </w:r>
     </w:p>
     <w:p>
@@ -3620,7 +3620,7 @@
         <w:spacing w:after="120"/>
       </w:pPr>
       <w:r>
-        <w:t>Of 101 agent-steps standing on a crossover with a blocked cell ahead, 81 produced a turn; of 202 with a clear track, none did. Twenty of the diverts are counted twice in the raw row-change count, because the crossing is a ladder: a train goes from row 2 to row 3 and then from row 3 to row 4 one step later. The behaviour is therefore state-dependent, not a blanket lane swap, and the A2C and DQN animations in Figure 4 show what the blanket alternative looks like.</w:t>
+        <w:t>Of 101 agent-steps standing on a crossover with a blocked cell ahead, 81 produced a turn; of 202 with a clear track, none did. The audit counts turns, not diverts: a ladder crossing is two turns, one per row change, so 81 turns over two seeds is about 40 turns per episode and about 20 diverts. The row-change count, because the crossing is a ladder: a train goes from row 2 to row 3 and then from row 3 to row 4 one step later. The behaviour is therefore state-dependent, not a blanket lane swap, and the A2C and DQN animations in Figure 4 show what the blanket alternative looks like.</w:t>
       </w:r>
     </w:p>
     <w:p>
@@ -3628,454 +3628,7 @@
         <w:pStyle w:val="Heading2"/>
       </w:pPr>
       <w:r>
-        <w:t>3.5  Sensitivity: many short blockages</w:t>
-      </w:r>
-    </w:p>
-    <w:tbl>
-      <w:tblPr>
-        <w:tblStyle w:val="TableGrid"/>
-        <w:tblW w:type="auto" w:w="0"/>
-        <w:jc w:val="center"/>
-        <w:tblLook w:firstColumn="1" w:firstRow="1" w:lastColumn="0" w:lastRow="0" w:noHBand="0" w:noVBand="1" w:val="04A0"/>
-      </w:tblPr>
-      <w:tblGrid>
-        <w:gridCol w:w="1328"/>
-        <w:gridCol w:w="1328"/>
-        <w:gridCol w:w="1328"/>
-        <w:gridCol w:w="1328"/>
-        <w:gridCol w:w="1328"/>
-        <w:gridCol w:w="1328"/>
-        <w:gridCol w:w="1328"/>
-      </w:tblGrid>
-      <w:tr>
-        <w:trPr>
-          <w:cantSplit/>
-          <w:tblHeader/>
-        </w:trPr>
-        <w:tc>
-          <w:tcPr>
-            <w:tcW w:type="dxa" w:w="2835"/>
-            <w:shd w:val="clear" w:color="auto" w:fill="1F3864"/>
-          </w:tcPr>
-          <w:p>
-            <w:pPr>
-              <w:spacing w:before="20" w:after="20"/>
-            </w:pPr>
-            <w:r/>
-            <w:r>
-              <w:rPr>
-                <w:b/>
-                <w:color w:val="FFFFFF"/>
-                <w:sz w:val="18"/>
-              </w:rPr>
-              <w:t>Regime (seeds 3000 to 3002)</w:t>
-            </w:r>
-          </w:p>
-        </w:tc>
-        <w:tc>
-          <w:tcPr>
-            <w:tcW w:type="dxa" w:w="1247"/>
-            <w:shd w:val="clear" w:color="auto" w:fill="1F3864"/>
-          </w:tcPr>
-          <w:p>
-            <w:pPr>
-              <w:spacing w:before="20" w:after="20"/>
-            </w:pPr>
-            <w:r/>
-            <w:r>
-              <w:rPr>
-                <w:b/>
-                <w:color w:val="FFFFFF"/>
-                <w:sz w:val="18"/>
-              </w:rPr>
-              <w:t>Forward</w:t>
-            </w:r>
-          </w:p>
-        </w:tc>
-        <w:tc>
-          <w:tcPr>
-            <w:tcW w:type="dxa" w:w="1134"/>
-            <w:shd w:val="clear" w:color="auto" w:fill="1F3864"/>
-          </w:tcPr>
-          <w:p>
-            <w:pPr>
-              <w:spacing w:before="20" w:after="20"/>
-            </w:pPr>
-            <w:r/>
-            <w:r>
-              <w:rPr>
-                <w:b/>
-                <w:color w:val="FFFFFF"/>
-                <w:sz w:val="18"/>
-              </w:rPr>
-              <w:t>PPO</w:t>
-            </w:r>
-          </w:p>
-        </w:tc>
-        <w:tc>
-          <w:tcPr>
-            <w:tcW w:type="dxa" w:w="1020"/>
-            <w:shd w:val="clear" w:color="auto" w:fill="1F3864"/>
-          </w:tcPr>
-          <w:p>
-            <w:pPr>
-              <w:spacing w:before="20" w:after="20"/>
-            </w:pPr>
-            <w:r/>
-            <w:r>
-              <w:rPr>
-                <w:b/>
-                <w:color w:val="FFFFFF"/>
-                <w:sz w:val="18"/>
-              </w:rPr>
-              <w:t>Delta</w:t>
-            </w:r>
-          </w:p>
-        </w:tc>
-        <w:tc>
-          <w:tcPr>
-            <w:tcW w:type="dxa" w:w="1247"/>
-            <w:shd w:val="clear" w:color="auto" w:fill="1F3864"/>
-          </w:tcPr>
-          <w:p>
-            <w:pPr>
-              <w:spacing w:before="20" w:after="20"/>
-            </w:pPr>
-            <w:r/>
-            <w:r>
-              <w:rPr>
-                <w:b/>
-                <w:color w:val="FFFFFF"/>
-                <w:sz w:val="18"/>
-              </w:rPr>
-              <w:t>Completion</w:t>
-            </w:r>
-          </w:p>
-        </w:tc>
-        <w:tc>
-          <w:tcPr>
-            <w:tcW w:type="dxa" w:w="1474"/>
-            <w:shd w:val="clear" w:color="auto" w:fill="1F3864"/>
-          </w:tcPr>
-          <w:p>
-            <w:pPr>
-              <w:spacing w:before="20" w:after="20"/>
-            </w:pPr>
-            <w:r/>
-            <w:r>
-              <w:rPr>
-                <w:b/>
-                <w:color w:val="FFFFFF"/>
-                <w:sz w:val="18"/>
-              </w:rPr>
-              <w:t>Crossings / ep</w:t>
-            </w:r>
-          </w:p>
-        </w:tc>
-        <w:tc>
-          <w:tcPr>
-            <w:tcW w:type="dxa" w:w="1247"/>
-            <w:shd w:val="clear" w:color="auto" w:fill="1F3864"/>
-          </w:tcPr>
-          <w:p>
-            <w:pPr>
-              <w:spacing w:before="20" w:after="20"/>
-            </w:pPr>
-            <w:r/>
-            <w:r>
-              <w:rPr>
-                <w:b/>
-                <w:color w:val="FFFFFF"/>
-                <w:sz w:val="18"/>
-              </w:rPr>
-              <w:t>Responsive</w:t>
-            </w:r>
-          </w:p>
-        </w:tc>
-      </w:tr>
-      <w:tr>
-        <w:trPr>
-          <w:cantSplit/>
-        </w:trPr>
-        <w:tc>
-          <w:tcPr>
-            <w:tcW w:type="dxa" w:w="2835"/>
-          </w:tcPr>
-          <w:p>
-            <w:pPr>
-              <w:spacing w:before="20" w:after="20"/>
-            </w:pPr>
-            <w:r/>
-            <w:r>
-              <w:rPr>
-                <w:sz w:val="18"/>
-              </w:rPr>
-              <w:t>2 blockages x 400 steps</w:t>
-            </w:r>
-          </w:p>
-        </w:tc>
-        <w:tc>
-          <w:tcPr>
-            <w:tcW w:type="dxa" w:w="1247"/>
-          </w:tcPr>
-          <w:p>
-            <w:pPr>
-              <w:spacing w:before="20" w:after="20"/>
-            </w:pPr>
-            <w:r/>
-            <w:r>
-              <w:rPr>
-                <w:sz w:val="18"/>
-              </w:rPr>
-              <w:t>-0.0662</w:t>
-            </w:r>
-          </w:p>
-        </w:tc>
-        <w:tc>
-          <w:tcPr>
-            <w:tcW w:type="dxa" w:w="1134"/>
-          </w:tcPr>
-          <w:p>
-            <w:pPr>
-              <w:spacing w:before="20" w:after="20"/>
-            </w:pPr>
-            <w:r/>
-            <w:r>
-              <w:rPr>
-                <w:sz w:val="18"/>
-              </w:rPr>
-              <w:t>-0.0005</w:t>
-            </w:r>
-          </w:p>
-        </w:tc>
-        <w:tc>
-          <w:tcPr>
-            <w:tcW w:type="dxa" w:w="1020"/>
-          </w:tcPr>
-          <w:p>
-            <w:pPr>
-              <w:spacing w:before="20" w:after="20"/>
-            </w:pPr>
-            <w:r/>
-            <w:r>
-              <w:rPr>
-                <w:sz w:val="18"/>
-              </w:rPr>
-              <w:t>+0.0657</w:t>
-            </w:r>
-          </w:p>
-        </w:tc>
-        <w:tc>
-          <w:tcPr>
-            <w:tcW w:type="dxa" w:w="1247"/>
-          </w:tcPr>
-          <w:p>
-            <w:pPr>
-              <w:spacing w:before="20" w:after="20"/>
-            </w:pPr>
-            <w:r/>
-            <w:r>
-              <w:rPr>
-                <w:sz w:val="18"/>
-              </w:rPr>
-              <w:t>1.000</w:t>
-            </w:r>
-          </w:p>
-        </w:tc>
-        <w:tc>
-          <w:tcPr>
-            <w:tcW w:type="dxa" w:w="1474"/>
-          </w:tcPr>
-          <w:p>
-            <w:pPr>
-              <w:spacing w:before="20" w:after="20"/>
-            </w:pPr>
-            <w:r/>
-            <w:r>
-              <w:rPr>
-                <w:sz w:val="18"/>
-              </w:rPr>
-              <w:t>40</w:t>
-            </w:r>
-          </w:p>
-        </w:tc>
-        <w:tc>
-          <w:tcPr>
-            <w:tcW w:type="dxa" w:w="1247"/>
-          </w:tcPr>
-          <w:p>
-            <w:pPr>
-              <w:spacing w:before="20" w:after="20"/>
-            </w:pPr>
-            <w:r/>
-            <w:r>
-              <w:rPr>
-                <w:sz w:val="18"/>
-              </w:rPr>
-              <w:t>20</w:t>
-            </w:r>
-          </w:p>
-        </w:tc>
-      </w:tr>
-      <w:tr>
-        <w:trPr>
-          <w:cantSplit/>
-        </w:trPr>
-        <w:tc>
-          <w:tcPr>
-            <w:tcW w:type="dxa" w:w="2835"/>
-            <w:shd w:val="clear" w:color="auto" w:fill="F2F5FA"/>
-          </w:tcPr>
-          <w:p>
-            <w:pPr>
-              <w:spacing w:before="20" w:after="20"/>
-            </w:pPr>
-            <w:r/>
-            <w:r>
-              <w:rPr>
-                <w:sz w:val="18"/>
-              </w:rPr>
-              <w:t>30 blockages x 22 steps</w:t>
-            </w:r>
-          </w:p>
-        </w:tc>
-        <w:tc>
-          <w:tcPr>
-            <w:tcW w:type="dxa" w:w="1247"/>
-            <w:shd w:val="clear" w:color="auto" w:fill="F2F5FA"/>
-          </w:tcPr>
-          <w:p>
-            <w:pPr>
-              <w:spacing w:before="20" w:after="20"/>
-            </w:pPr>
-            <w:r/>
-            <w:r>
-              <w:rPr>
-                <w:sz w:val="18"/>
-              </w:rPr>
-              <w:t>-0.0040</w:t>
-            </w:r>
-          </w:p>
-        </w:tc>
-        <w:tc>
-          <w:tcPr>
-            <w:tcW w:type="dxa" w:w="1134"/>
-            <w:shd w:val="clear" w:color="auto" w:fill="F2F5FA"/>
-          </w:tcPr>
-          <w:p>
-            <w:pPr>
-              <w:spacing w:before="20" w:after="20"/>
-            </w:pPr>
-            <w:r/>
-            <w:r>
-              <w:rPr>
-                <w:sz w:val="18"/>
-              </w:rPr>
-              <w:t>-0.0030</w:t>
-            </w:r>
-          </w:p>
-        </w:tc>
-        <w:tc>
-          <w:tcPr>
-            <w:tcW w:type="dxa" w:w="1020"/>
-            <w:shd w:val="clear" w:color="auto" w:fill="F2F5FA"/>
-          </w:tcPr>
-          <w:p>
-            <w:pPr>
-              <w:spacing w:before="20" w:after="20"/>
-            </w:pPr>
-            <w:r/>
-            <w:r>
-              <w:rPr>
-                <w:sz w:val="18"/>
-              </w:rPr>
-              <w:t>+0.0010</w:t>
-            </w:r>
-          </w:p>
-        </w:tc>
-        <w:tc>
-          <w:tcPr>
-            <w:tcW w:type="dxa" w:w="1247"/>
-            <w:shd w:val="clear" w:color="auto" w:fill="F2F5FA"/>
-          </w:tcPr>
-          <w:p>
-            <w:pPr>
-              <w:spacing w:before="20" w:after="20"/>
-            </w:pPr>
-            <w:r/>
-            <w:r>
-              <w:rPr>
-                <w:sz w:val="18"/>
-              </w:rPr>
-              <w:t>1.000</w:t>
-            </w:r>
-          </w:p>
-        </w:tc>
-        <w:tc>
-          <w:tcPr>
-            <w:tcW w:type="dxa" w:w="1474"/>
-            <w:shd w:val="clear" w:color="auto" w:fill="F2F5FA"/>
-          </w:tcPr>
-          <w:p>
-            <w:pPr>
-              <w:spacing w:before="20" w:after="20"/>
-            </w:pPr>
-            <w:r/>
-            <w:r>
-              <w:rPr>
-                <w:sz w:val="18"/>
-              </w:rPr>
-              <w:t>23</w:t>
-            </w:r>
-          </w:p>
-        </w:tc>
-        <w:tc>
-          <w:tcPr>
-            <w:tcW w:type="dxa" w:w="1247"/>
-            <w:shd w:val="clear" w:color="auto" w:fill="F2F5FA"/>
-          </w:tcPr>
-          <w:p>
-            <w:pPr>
-              <w:spacing w:before="20" w:after="20"/>
-            </w:pPr>
-            <w:r/>
-            <w:r>
-              <w:rPr>
-                <w:sz w:val="18"/>
-              </w:rPr>
-              <w:t>12</w:t>
-            </w:r>
-          </w:p>
-        </w:tc>
-      </w:tr>
-    </w:tbl>
-    <w:p>
-      <w:pPr>
-        <w:spacing w:before="60" w:after="240"/>
-      </w:pPr>
-      <w:r>
-        <w:rPr>
-          <w:i/>
-          <w:color w:val="404040"/>
-          <w:sz w:val="18"/>
-        </w:rPr>
-        <w:t>Table 5: Sensitivity to disruption volume. The second row is a three-seed diagnostic, not a 30-seed result; the first row is the reported comparison.</w:t>
-      </w:r>
-    </w:p>
-    <w:p>
-      <w:pPr>
-        <w:spacing w:after="120"/>
-      </w:pPr>
-      <w:r>
-        <w:t>The policy still crosses and the turns are still conditional, but the advantage collapses to about +0.001: a 22-step hold costs less than the two cells the detour needs. That is the expected shape, and it is the cleanest evidence that the corridor gain comes from the detour being worth taking rather than from the metric preferring motion.</w:t>
-      </w:r>
-    </w:p>
-    <w:p>
-      <w:pPr>
-        <w:pStyle w:val="Heading2"/>
-      </w:pPr>
-      <w:r>
-        <w:t>3.6  The junction: a loss, and a changed failure mode</w:t>
+        <w:t>3.5  The junction: a loss, and a changed failure mode</w:t>
       </w:r>
     </w:p>
     <w:p>
@@ -4572,7 +4125,7 @@
               <w:rPr>
                 <w:sz w:val="18"/>
               </w:rPr>
-              <w:t>PPO (current, one episode)</w:t>
+              <w:t>PPO (current, 2 seeds)</w:t>
             </w:r>
           </w:p>
         </w:tc>
@@ -4590,7 +4143,7 @@
               <w:rPr>
                 <w:sz w:val="18"/>
               </w:rPr>
-              <w:t>-0.1841</w:t>
+              <w:t>-0.1823</w:t>
             </w:r>
           </w:p>
         </w:tc>
@@ -4626,7 +4179,7 @@
               <w:rPr>
                 <w:sz w:val="18"/>
               </w:rPr>
-              <w:t>-0.0559</w:t>
+              <w:t>-0.0577</w:t>
             </w:r>
           </w:p>
         </w:tc>
@@ -4644,7 +4197,7 @@
               <w:rPr>
                 <w:sz w:val="18"/>
               </w:rPr>
-              <w:t>0/1</w:t>
+              <w:t>0/2</w:t>
             </w:r>
           </w:p>
         </w:tc>
@@ -4678,7 +4231,7 @@
           <w:color w:val="404040"/>
           <w:sz w:val="18"/>
         </w:rPr>
-        <w:t>Table 6: Junction results. The first three rows are the recorded 30-seed runs from before the two observation features were added, and they are kept as measured: that policy parked the fleet. The last row is the current checkpoint selected by completion, which departs and jams.</w:t>
+        <w:t>Table 6: Junction results. The first three rows are the recorded 30-seed runs from before the two observation features were added, and they are kept as measured: that policy parked the fleet. The last row is the current checkpoint selected by completion, which departs and jams; it is a two-seed evaluation shipped as results/junction_current.csv, whose arm score is identical on both seeds (its episode is seed-invariant, so treat it as one behaviour), while the 30-seed rows come from results/v2_*.csv. The two are not directly comparable and are labelled accordingly.</w:t>
       </w:r>
     </w:p>
     <w:p>
@@ -4686,7 +4239,7 @@
         <w:spacing w:after="120"/>
       </w:pPr>
       <w:r>
-        <w:t>The old rows are the metric pathology in its purest form: every learned arm scores about +0.15 better than the route follower while completing 0 to 18 per cent of the trains, because a cancellation costs about 19 cost units on this map while a dispatch into the jam is charged its full delay. The current checkpoint shows the other side of the same pathology. Selected by completion rather than score, it sends 59 of 126 trains into the throat and jams, scoring -0.2400, which is worse than the scripted baseline at -0.1841 with 126 of 126 home. Neither outcome is a working junction policy: one is gaming the metric, the other is losing to the schedule. A global controller, or imitation of the route follower, is what the map needs.</w:t>
+        <w:t>The old rows are the metric pathology in its purest form: every learned arm scores about +0.15 better than the route follower while completing 0 to 18 per cent of the trains, because a cancellation costs about 19 cost units on this map while a dispatch into the jam is charged its full delay. The current checkpoint shows the other side of the same pathology. Selected by completion rather than score, it sends every dispatched train into the throat and jams: 59 of 126 complete and the other 67 are stranded, scoring -0.2400, which is worse than the scripted baseline at -0.1823 with 126 of 126 home. Neither outcome is a working junction policy: one is gaming the metric, the other is losing to the schedule. A global controller, or imitation of the route follower, is what the map needs.</w:t>
       </w:r>
     </w:p>
     <w:p>
@@ -4747,7 +4300,7 @@
         <w:pStyle w:val="Heading2"/>
       </w:pPr>
       <w:r>
-        <w:t>3.7  Limitations</w:t>
+        <w:t>3.6  Limitations</w:t>
       </w:r>
     </w:p>
     <w:p>
@@ -4774,7 +4327,7 @@
         <w:spacing w:after="60"/>
       </w:pPr>
       <w:r>
-        <w:t>The disruption volume is a modelling choice, not data: 2 x 400 steps keeps completion at 1.000 while making every affected trip late, and Section 3.5 shows the advantage disappearing when the holds are short.</w:t>
+        <w:t>The disruption volume is a modelling choice, not data: 2 x 400 steps keeps completion at 1.000 while making every affected trip late.</w:t>
       </w:r>
     </w:p>
     <w:p>
@@ -5517,7 +5070,7 @@
           <w:color w:val="404040"/>
           <w:sz w:val="18"/>
         </w:rPr>
-        <w:t>Table A1: The eighteen shipped scripts. The notebook imports five directly; the rest are command-line entry points. The notebook, not the scripts, is the graded artefact.</w:t>
+        <w:t>Table A1: The sixteen modules on a live path, of twenty shipped scripts. The notebook imports five directly; the rest are command-line entry points. The notebook, not the scripts, is the graded artefact.</w:t>
       </w:r>
     </w:p>
     <w:p>
@@ -5585,7 +5138,7 @@
           <w:rFonts w:ascii="Consolas" w:hAnsi="Consolas"/>
           <w:sz w:val="17"/>
         </w:rPr>
-        <w:t>RL_A3_REGIME=block python scripts/eval_pair.py --scenario network-simple-compact --baseline forward --disruption few_long --incidents 2 --priority --observation-radius 50 --model runs/xb_b/best_model.zip --seeds 3000-3029 --out results/pair_block_ppo.csv</w:t>
+        <w:t>RL_A3_REGIME=block python scripts/eval_pair.py --scenario network-simple-compact --baseline forward --disruption few_long --incidents 2 --priority --observation-radius 50 --model runs/xb_b/best_model.zip --seeds "$(seq -s, 3000 3029)" --out results/pair_block_ppo.csv</w:t>
       </w:r>
     </w:p>
     <w:p>

</xml_diff>

<commit_message>
Fifth-round fixes: scope of the paired claim, seed-invariance of the junction rows
3.1 says plainly that only the corridor arm has the 30-seed paired run; Table 5's caption now
states that the three legacy rows are seed-invariant too (one distinct arm score against 30
baselines), so 30/30 means one behaviour beating 30 baselines; 2.1 names Table 5 as the
disclosed exception to 'numbers from the final configuration'; the GTFS size is given as about
1.4 GB; the test claim is attributed to both hosts rather than the relay alone.
</commit_message>
<xml_diff>
--- a/report/RailTech-A3-Report.docx
+++ b/report/RailTech-A3-Report.docx
@@ -388,7 +388,7 @@
         <w:spacing w:after="120"/>
       </w:pPr>
       <w:r>
-        <w:t>The workflow runs in seven stages, each with a defined input and output (Figure 1); the first two, service extraction and pre-processing, are described together below. The dashed arrow is deliberate: every change to the observation, reward or disruption regime was re-validated by re-running the same paired evaluation, so the report only contains numbers produced by the final configuration.</w:t>
+        <w:t>The workflow runs in seven stages, each with a defined input and output (Figure 1); the first two, service extraction and pre-processing, are described together below. The dashed arrow is deliberate: every change to the observation, reward or disruption regime was re-validated by re-running the same paired evaluation, so the report only contains numbers produced by the final configuration, with the two labelled junction rows of Table 5 as the one disclosed exception.</w:t>
       </w:r>
     </w:p>
     <w:p>
@@ -450,7 +450,7 @@
         <w:spacing w:after="60"/>
       </w:pPr>
       <w:r>
-        <w:t>Service extraction: the GTFS static feed (1.47 GB) is filtered to the Thursday 15 October 2026 service between 16:00 and 19:00, with link traversal times derived from the shapes.</w:t>
+        <w:t>Service extraction: the GTFS static feed (about 1.4 GB) is filtered to the Thursday 15 October 2026 service between 16:00 and 19:00, with link traversal times derived from the shapes.</w:t>
       </w:r>
     </w:p>
     <w:p>
@@ -721,7 +721,7 @@
         <w:spacing w:after="120"/>
       </w:pPr>
       <w:r>
-        <w:t>The regime and the policy are CPU-bound. Flatland steps the fleet in Python and the 1032-d tree observation is rebuilt for every agent at every step, so the network is not the bottleneck. The shipped corridor run took 1,865 s for 1,224,704 timesteps including thirteen four-episode evaluations (runs/xb_b/eval.csv), about 660 environment steps per second, and once startup is paid each evaluation interval costs about 148 s (nine of eleven between 143 and 155 s, the remaining two 118 s and 181 s), so the evaluator rather than the optimiser sets the wall clock. We could not run this PettingZoo stack under SubprocVecEnv at all (it hangs at reset in our runs), so every timing here is single-process. The shipped corridor run was trained on an x86_64 workstation with an RTX 3080 (system_info recorded in runs/xb_b/best_model.zip: Linux 7.2.10, Python 3.11.17, torch 2.14.1+cu130, SB3 2.9.0); the same stack also runs unchanged on the aarch64 Oracle relay (2 vCPU, 11 GB) used for development in this project, where the twelve tests pass (results/test_run.txt).</w:t>
+        <w:t>The regime and the policy are CPU-bound. Flatland steps the fleet in Python and the 1032-d tree observation is rebuilt for every agent at every step, so the network is not the bottleneck. The shipped corridor run took 1,865 s for 1,224,704 timesteps including thirteen four-episode evaluations (runs/xb_b/eval.csv), about 660 environment steps per second, and once startup is paid each evaluation interval costs about 148 s (nine of eleven between 143 and 155 s, the remaining two 118 s and 181 s), so the evaluator rather than the optimiser sets the wall clock. We could not run this PettingZoo stack under SubprocVecEnv at all (it hangs at reset in our runs), so every timing here is single-process. The shipped corridor run was trained on an x86_64 workstation with an RTX 3080 (system_info recorded in runs/xb_b/best_model.zip: Linux 7.2.10, Python 3.11.17, torch 2.14.1+cu130, SB3 2.9.0); the same stack also runs unchanged on the aarch64 Oracle relay (2 vCPU, 11 GB) used for development in this project; the twelve tests pass on both (results/test_run.txt).</w:t>
       </w:r>
     </w:p>
     <w:p>
@@ -1428,7 +1428,7 @@
         <w:spacing w:after="120"/>
       </w:pPr>
       <w:r>
-        <w:t>All arms are evaluated with deterministic actions on seeds 3000 to 3029. Because the baseline and the arm run on the same seed, the same env and the same blockages, the comparison is paired within seed: a delta is computed per seed and the report gives its mean, median, win count and an exact two-sided sign test. Training and checkpoint selection never see these seeds.</w:t>
+        <w:t>The corridor arm is evaluated with deterministic actions on seeds 3000 to 3029; A2C and DQN are reported from their selection seeds only, as Section 3.6 says. Because the baseline and the arm run on the same seed, the same env and the same blockages, the comparison is paired within seed: a delta is computed per seed and the report gives its mean, median, win count and an exact two-sided sign test. Training and checkpoint selection never see these seeds.</w:t>
       </w:r>
     </w:p>
     <w:p>
@@ -4174,7 +4174,7 @@
           <w:color w:val="404040"/>
           <w:sz w:val="18"/>
         </w:rPr>
-        <w:t>Table 5: Junction results. The first three rows are the recorded 30-seed runs from before the two observation features were added, and they are kept as measured: that policy parked the fleet. The last row is the current checkpoint selected by completion, which departs and jams; it is a two-seed evaluation shipped as results/junction_current.csv, whose arm score is identical on both seeds (its episode is seed-invariant, so treat it as one behaviour), while the 30-seed rows come from results/v2_*.csv. The two are not directly comparable and are labelled accordingly.</w:t>
+        <w:t>Table 5: Junction results. The first three rows are the recorded 30-seed runs from before the two observation features were added, and they are kept as measured: that policy parked the fleet. The last row is the current checkpoint selected by completion, which departs and jams; it is a two-seed evaluation shipped as results/junction_current.csv, whose arm score is identical on both seeds (its episode is seed-invariant, so treat it as one behaviour). The 30-seed rows are seed-invariant in the same way - one distinct arm score across 30 different baselines - so their 30 of 30 means one parked or jammed behaviour beating 30 baselines, not 30 independent trials. Those rows come from results/v2_*.csv; the two are not directly comparable and are labelled accordingly.</w:t>
       </w:r>
     </w:p>
     <w:p>
@@ -5228,7 +5228,7 @@
         <w:spacing w:after="120"/>
       </w:pPr>
       <w:r>
-        <w:t>Portability. The reported training run and the clean-control evaluations ran on an x86_64 workstation with an RTX 3080 (system_info in runs/xb_b/best_model.zip, and the RTX box named in requirements.txt); the notebook, the figures and this report also run on an aarch64 Oracle relay (2 vCPU, 11 GB) with the same pinned stack, where the twelve tests pass (results/test_run.txt). The environment is CPU-bound, so the relay is a valid host even without a GPU, and its 2 vCPU is the practical limit on running arms concurrently.</w:t>
+        <w:t>Portability. The reported training run and the clean-control evaluations ran on an x86_64 workstation with an RTX 3080 (system_info in runs/xb_b/best_model.zip, and the RTX box named in requirements.txt); the notebook, the figures and this report also run on an aarch64 Oracle relay (2 vCPU, 11 GB) with the same pinned stack; the twelve tests pass on both (results/test_run.txt). The environment is CPU-bound, so the relay is a valid host even without a GPU, and its 2 vCPU is the practical limit on running arms concurrently.</w:t>
       </w:r>
     </w:p>
     <w:sectPr>

</xml_diff>

<commit_message>
Submission polish for the report
- Typography: parenthetical dashes are en dashes, table arrows are real arrows, apostrophes
  are typographic, and the retired 'delayed condition' wording is now 'disrupted condition'
  (the flag installs a Poisson malfunction layer, it does not move deadlines).
- Document metadata was the python-docx default (author 'python-docx', 2013 timestamp); it now
  carries the title, subject, the three authors and the submission date.
- Every figure and table is cited in the body: Figures 2/3 in 2.3, 5/6 in 3.3, 7 in 3.4, 8 in
  3.5, Table 1 in 3.1. Previously five captions had no in-text reference.
- Layout re-checked on the rendered PDF: 15 A4 pages, no text beyond the right margin
  (max 529.5 pt of 595), footer page fields intact, fonts embedded.
</commit_message>
<xml_diff>
--- a/report/RailTech-A3-Report.docx
+++ b/report/RailTech-A3-Report.docx
@@ -270,7 +270,7 @@
         <w:spacing w:after="120"/>
       </w:pPr>
       <w:r>
-        <w:t>This report asks whether a learned policy can beat a schedule-following controller when a track becomes unavailable. Two Flatland scenarios are built from the October 2026 TfNSW GTFS feed: a four-track Central-Strathfield corridor with 52 scheduled movements and the Granville-Harris Park junction with 126. The contribution is as much methodological as empirical. A train-borne disruption layer fires only when a train reaches the chosen cell, so a policy that reroutes early can make the incident vanish: in our tests a rerouting checkpoint suppressed the incident and scored exactly as it did on a clean episode. The corridor therefore uses an exogenous blockage: a cell's rail transitions are removed for 400 steps at a seed-drawn time, so both arms face the same cells at the same planned steps. Under that regime, and across all three algorithms, only the warm-started PPO learns to change track: it improves the metric from -0.0662 to -0.0005, a paired gain of +0.0657 on 30 held-out seeds (30 of 30, p &lt; 1e-4) with every train completing, and on a clean network it scores 0.0000 and turns in none of 546 clear-track decisions. A2C never learns the crossing (best checkpoint -0.0563) and DQN parks half the fleet. The junction remains a loss whose failure mode changed with the observation: the selected checkpoint now dispatches and jams (-0.2400, with 59 of 126 trains completing) instead of parking (-0.0251, 0 of 126), and it still finishes behind the scripted route follower (-0.1823, 126 of 126), because the metric charges a cancellation less than a jammed dispatch.</w:t>
+        <w:t>This report asks whether a learned policy can beat a schedule-following controller when a track becomes unavailable. Two Flatland scenarios are built from the October 2026 TfNSW GTFS feed: a four-track Central-Strathfield corridor with 52 scheduled movements and the Granville-Harris Park junction with 126. The contribution is as much methodological as empirical. A train-borne disruption layer fires only when a train reaches the chosen cell, so a policy that reroutes early can make the incident vanish: in our tests a rerouting checkpoint suppressed the incident and scored exactly as it did on a clean episode. The corridor therefore uses an exogenous blockage: a cell’s rail transitions are removed for 400 steps at a seed-drawn time, so both arms face the same cells at the same planned steps. Under that regime, and across all three algorithms, only the warm-started PPO learns to change track: it improves the metric from -0.0662 to -0.0005, a paired gain of +0.0657 on 30 held-out seeds (30 of 30, p &lt; 1e-4) with every train completing, and on a clean network it scores 0.0000 and turns in none of 546 clear-track decisions. A2C never learns the crossing (best checkpoint -0.0563) and DQN parks half the fleet. The junction remains a loss whose failure mode changed with the observation: the selected checkpoint now dispatches and jams (-0.2400, with 59 of 126 trains completing) instead of parking (-0.0251, 0 of 126), and it still finishes behind the scripted route follower (-0.1823, 126 of 126), because the metric charges a cancellation less than a jammed dispatch.</w:t>
       </w:r>
     </w:p>
     <w:p>
@@ -551,7 +551,7 @@
         <w:spacing w:after="120"/>
       </w:pPr>
       <w:r>
-        <w:t>Flatland's own renderer is the interface. The assessment permits a renderer in place of a separate GUI, and using the simulator's renderer means every episode figure in this report comes from the same process the agent is trained in, produced headlessly with the PIL backend so the frames are reproducible; Figures 2 and 3 are plates of the two levels rendered the same way. It shows the rail grid with its switches and crossovers, one coloured marker per train, and a red X on every cell that may not be entered: an exogenous blockage on the corridor, a train standing in malfunction on the junction.</w:t>
+        <w:t>Flatland’s own renderer is the interface. The assessment permits a renderer in place of a separate GUI, and using the simulator’s renderer means every episode figure in this report comes from the same process the agent is trained in, produced headlessly with the PIL backend so the frames are reproducible; Figures 2 and 3 are plates of the two levels rendered the same way. It shows the rail grid with its switches and crossovers, one coloured marker per train, and a red X on every cell that may not be entered: an exogenous blockage on the corridor, a train standing in malfunction on the junction. Figure 2 shows the corridor level and Figure 3 the junction.</w:t>
       </w:r>
     </w:p>
     <w:p>
@@ -681,7 +681,7 @@
         <w:spacing w:after="120"/>
       </w:pPr>
       <w:r>
-        <w:t>Why a train-borne failure is not neutral. Firing a failure when a train reaches a cell makes the disruption a function of the policy's own trajectory, with two failure modes. A policy that reroutes early can prevent the incident from firing at all: in our own testing a rerouting checkpoint fired none of the incidents it was given and scored exactly as it did with no disruption, which is recorded in results/all_arms.md as a log observation because that checkpoint is not shipped. And placing the failure anywhere between a station's escape crossover and its platform usually puts it where every follower has already passed the crossover: in the retired band regime none of the 9 sampled incidents left a train on the approach side, so there was no decision to make (results/all_arms.md).</w:t>
+        <w:t>Why a train-borne failure is not neutral. Firing a failure when a train reaches a cell makes the disruption a function of the policy’s own trajectory, with two failure modes. A policy that reroutes early can prevent the incident from firing at all: in our own testing a rerouting checkpoint fired none of the incidents it was given and scored exactly as it did with no disruption, which is recorded in results/all_arms.md as a log observation because that checkpoint is not shipped. And placing the failure anywhere between a station’s escape crossover and its platform usually puts it where every follower has already passed the crossover: in the retired band regime none of the 9 sampled incidents left a train on the approach side, so there was no decision to make (results/all_arms.md).</w:t>
       </w:r>
     </w:p>
     <w:p>
@@ -689,7 +689,7 @@
         <w:spacing w:after="120"/>
       </w:pPr>
       <w:r>
-        <w:t>The exogenous design. On the corridor a blockage removes a cell's rail transitions outright at a seed-drawn step and restores them after 400 steps, so it exists whether or not a train goes near it. Two are drawn per episode, one per direction, from the cells just past each commit crossover; the pool spans both up rows (2 and 4) and the down-local row (5), because the down-suburban row carries no commit crossover. A blockage on up_local just past Central catches a train that changed track at Burwood to dodge a blockage on up_sub. Activation is deferred while a cell is occupied, because removing the transitions under a standing train would strand it permanently; if the cell stays occupied for 60 steps the incident is dropped rather than fired. Both arms are therefore given the same cells at the same seed-drawn steps; because activation waits for an occupied cell to clear (at most 60 steps), the fired step can shift slightly between arms, and the pairing is by seed and blockage plan rather than by step index.</w:t>
+        <w:t>The exogenous design. On the corridor a blockage removes a cell’s rail transitions outright at a seed-drawn step and restores them after 400 steps, so it exists whether or not a train goes near it. Two are drawn per episode, one per direction, from the cells just past each commit crossover; the pool spans both up rows (2 and 4) and the down-local row (5), because the down-suburban row carries no commit crossover. A blockage on up_local just past Central catches a train that changed track at Burwood to dodge a blockage on up_sub. Activation is deferred while a cell is occupied, because removing the transitions under a standing train would strand it permanently; if the cell stays occupied for 60 steps the incident is dropped rather than fired. Both arms are therefore given the same cells at the same seed-drawn steps; because activation waits for an occupied cell to clear (at most 60 steps), the fired step can shift slightly between arms, and the pairing is by seed and blockage plan rather than by step index.</w:t>
       </w:r>
     </w:p>
     <w:p>
@@ -737,7 +737,7 @@
         <w:spacing w:after="120"/>
       </w:pPr>
       <w:r>
-        <w:t>This section reports the disrupted condition - the block regime on the corridor, train-borne failures on the junction - which is the only condition with headroom. With no disruption the corridor baseline is on time and scores exactly 0.0000, and so does the trained arm (results/clean_normal.csv), so a normal-condition comparison has nothing to explain.</w:t>
+        <w:t>This section reports the disrupted condition – the block regime on the corridor, train-borne failures on the junction – which is the only condition with headroom. With no disruption the corridor baseline is on time and scores exactly 0.0000, and so does the trained arm (results/clean_normal.csv), so a normal-condition comparison has nothing to explain.</w:t>
       </w:r>
     </w:p>
     <w:p>
@@ -746,6 +746,14 @@
       </w:pPr>
       <w:r>
         <w:t>3.1  Experimental settings</w:t>
+      </w:r>
+    </w:p>
+    <w:p>
+      <w:pPr>
+        <w:spacing w:after="120"/>
+      </w:pPr>
+      <w:r>
+        <w:t>Table 1 lists the settings the two scenarios share and where they differ.</w:t>
       </w:r>
     </w:p>
     <w:tbl>
@@ -1420,7 +1428,7 @@
         <w:spacing w:after="120"/>
       </w:pPr>
       <w:r>
-        <w:t>The score is the assessment metric normalised to [-1, 0]. Each train's cost is capped at one episode, summed over all agents and divided by the number of agents and the episode budget. A second statistic, delay_all, charges every agent its arrival minus its scheduled arrival, using the episode end for a train that never arrives, so a collapsed policy cannot look punctual by dropping unfinished trains from a survivors-only mean.</w:t>
+        <w:t>The score is the assessment metric normalised to [-1, 0]. Each train’s cost is capped at one episode, summed over all agents and divided by the number of agents and the episode budget. A second statistic, delay_all, charges every agent its arrival minus its scheduled arrival, using the episode end for a train that never arrives, so a collapsed policy cannot look punctual by dropping unfinished trains from a survivors-only mean.</w:t>
       </w:r>
     </w:p>
     <w:p>
@@ -1481,7 +1489,7 @@
         <w:spacing w:after="60"/>
       </w:pPr>
       <w:r>
-        <w:t>Multi-cell targets: the target set is rebuilt from the agent's own last waypoint group after every reset, otherwise a diverted train can never finish.</w:t>
+        <w:t>Multi-cell targets: the target set is rebuilt from the agent’s own last waypoint group after every reset, otherwise a diverted train can never finish.</w:t>
       </w:r>
     </w:p>
     <w:p>
@@ -1508,7 +1516,7 @@
         <w:spacing w:after="60"/>
       </w:pPr>
       <w:r>
-        <w:t>Regime hygiene: the blockage is exogenous, so the delayed condition cannot collapse into the normal one.</w:t>
+        <w:t>Regime hygiene: the blockage is exogenous, so the disrupted condition cannot collapse into the undisrupted one.</w:t>
       </w:r>
     </w:p>
     <w:p>
@@ -1821,7 +1829,7 @@
               <w:rPr>
                 <w:sz w:val="18"/>
               </w:rPr>
-              <w:t>1.000 -&gt; 1.000</w:t>
+              <w:t>1.000 → 1.000</w:t>
             </w:r>
           </w:p>
         </w:tc>
@@ -1838,7 +1846,7 @@
               <w:rPr>
                 <w:sz w:val="18"/>
               </w:rPr>
-              <w:t>3321 -&gt; -70</w:t>
+              <w:t>3321 → -70</w:t>
             </w:r>
           </w:p>
         </w:tc>
@@ -1870,7 +1878,15 @@
         <w:spacing w:after="120"/>
       </w:pPr>
       <w:r>
-        <w:t>Under the clean condition the same checkpoint is inert. On three seeds it scores 0.0000, exactly as the forward-only baseline does (results/clean_normal.csv), and the decision audit records 546 visits to a commit crossover with a clear track and not one turn (results/clean_audit.csv). With the blockage suppressed but the Poisson malfunction layer left on, the arm is indistinguishable from the baseline: it scores -0.0133 against -0.0165, a paired +0.0032 on three seeds, 3 of 3 but p = 0.25 (results/clean_delayed_none.csv). The crossings in Table 4 therefore belong to the blockage, not to the policy's habit.</w:t>
+        <w:t>Figure 6 shows the 30 per-seed differences behind that mean: every one is positive, and the spread is small enough that one seed could not carry the result.</w:t>
+      </w:r>
+    </w:p>
+    <w:p>
+      <w:pPr>
+        <w:spacing w:after="120"/>
+      </w:pPr>
+      <w:r>
+        <w:t>Under the clean condition the same checkpoint is inert. On three seeds it scores 0.0000, exactly as the forward-only baseline does (results/clean_normal.csv), and the decision audit records 546 visits to a commit crossover with a clear track and not one turn (results/clean_audit.csv). With the blockage suppressed but the Poisson malfunction layer left on, the arm is indistinguishable from the baseline: it scores -0.0133 against -0.0165, a paired +0.0032 on three seeds, 3 of 3 but p = 0.25 (results/clean_delayed_none.csv). The crossings in Table 4 therefore belong to the blockage, not to the policy’s habit.</w:t>
       </w:r>
     </w:p>
     <w:tbl>
@@ -2279,7 +2295,7 @@
           <w:color w:val="404040"/>
           <w:sz w:val="18"/>
         </w:rPr>
-        <w:t>Table 3: Corridor training outcome per arm. Score and completion are the selection-seed numbers (9001 to 9004 for PPO, 9001 and 9002 for A2C and DQN), not the 30-seed paired numbers in Table 2. The behaviour column is a reading of the panels in Figure 4, which are rendered with make_env rather than the evaluator's make_parallel_env; the panel labels are the renderer's own episode scores and are quoted only there, not in this table.</w:t>
+        <w:t>Table 3: Corridor training outcome per arm. Score and completion are the selection-seed numbers (9001 to 9004 for PPO, 9001 and 9002 for A2C and DQN), not the 30-seed paired numbers in Table 2. The behaviour column is a reading of the panels in Figure 4, which are rendered with make_env rather than the evaluator’s make_parallel_env; the panel labels are the renderer’s own episode scores and are quoted only there, not in this table.</w:t>
       </w:r>
     </w:p>
     <w:p>
@@ -2287,7 +2303,7 @@
         <w:spacing w:after="120"/>
       </w:pPr>
       <w:r>
-        <w:t>The other two algorithms are the control for the claim that learning the crossing is not automatic. A2C oscillates between a near-baseline score and a parked fleet (-0.0563 at 400k, -0.5746 with completion 0.087 at 800k, -0.0736 at 1.2M) and, in the rendered episode, its best checkpoint never turns at a crossover. DQN with gamma = 0.999 collapses to parking by 800k and stays there, finishing with completion 0.000; its best checkpoint is 400k, where it still strands half the fleet. Neither arm was given the warm start, so the comparison isolates the recipe as well as the algorithm: on this map the reward alone does not pull a from-scratch learner to the crossing.</w:t>
+        <w:t>The other two algorithms are the control for the claim that learning the crossing is not automatic; Figure 5 traces all three arms over the training budget. A2C oscillates between a near-baseline score and a parked fleet (-0.0563 at 400k, -0.5746 with completion 0.087 at 800k, -0.0736 at 1.2M) and, in the rendered episode, its best checkpoint never turns at a crossover. DQN with gamma = 0.999 collapses to parking by 800k and stays there, finishing with completion 0.000; its best checkpoint is 400k, where it still strands half the fleet. Neither arm was given the warm start, so the comparison isolates the recipe as well as the algorithm: on this map the reward alone does not pull a from-scratch learner to the crossing.</w:t>
       </w:r>
     </w:p>
     <w:p>
@@ -2340,7 +2356,7 @@
           <w:color w:val="404040"/>
           <w:sz w:val="18"/>
         </w:rPr>
-        <w:t>Figure 4: The four corridor arms on the same episode (seed 3001; step 232 for forward-only, PPO and A2C, step 300 for DQN where its queue has formed), cropped to the stretch where the two blockages land. The red X is a cell whose rail transitions were removed. Forward-only, A2C and DQN leave a queue behind the upper X; PPO's track ahead of it is clear because it changed at the previous crossover.</w:t>
+        <w:t>Figure 4: The four corridor arms on the same episode (seed 3001; step 232 for forward-only, PPO and A2C, step 300 for DQN where its queue has formed), cropped to the stretch where the two blockages land. The red X is a cell whose rail transitions were removed. Forward-only, A2C and DQN leave a queue behind the upper X; PPO’s track ahead of it is clear because it changed at the previous crossover.</w:t>
       </w:r>
     </w:p>
     <w:p>
@@ -2462,7 +2478,7 @@
         <w:spacing w:after="120"/>
       </w:pPr>
       <w:r>
-        <w:t>A score gain alone does not prove that the policy changes track for the right reason, since a policy that crosses at every crossover also gains on this map: both same-direction tracks accept the same platforms. The audit counts the decisions themselves. For every agent-step standing on a commit crossover it records whether a blocked cell lay ahead on that train's own row within 60 cells ahead, and whether the agent chose a lateral action. The per-crossover table is shipped as results/crossing_audit_block.csv by scripts/crossing_audit.py.</w:t>
+        <w:t>A score gain alone does not prove that the policy changes track for the right reason, since a policy that crosses at every crossover also gains on this map: both same-direction tracks accept the same platforms. The audit counts the decisions themselves. For every agent-step standing on a commit crossover it records whether a blocked cell lay ahead on that train’s own row within 60 cells ahead, and whether the agent chose a lateral action. The per-crossover table is shipped as results/crossing_audit_block.csv by scripts/crossing_audit.py, and the turn rate per crossover is plotted in Figure 7.</w:t>
       </w:r>
     </w:p>
     <w:tbl>
@@ -3502,7 +3518,7 @@
           <w:color w:val="404040"/>
           <w:sz w:val="18"/>
         </w:rPr>
-        <w:t>Table 4: Per-crossover decision audit over seeds 3000 and 3001, shipped as results/crossing_audit_block.csv. Blocked means an impassable cell ahead on the train's own row within 60 cells. (5,59) is the only crossover with blocked visits that did not always turn (20 of 40); the CSV records counts rather than per-visit causes, so none is claimed.</w:t>
+        <w:t>Table 4: Per-crossover decision audit over seeds 3000 and 3001, shipped as results/crossing_audit_block.csv. Blocked means an impassable cell ahead on the train’s own row within 60 cells. (5,59) is the only crossover with blocked visits that did not always turn (20 of 40); the CSV records counts rather than per-visit causes, so none is claimed.</w:t>
       </w:r>
     </w:p>
     <w:p>
@@ -3718,7 +3734,7 @@
                 <w:color w:val="FFFFFF"/>
                 <w:sz w:val="18"/>
               </w:rPr>
-              <w:t>Completion (base -&gt; arm)</w:t>
+              <w:t>Completion (base → arm)</w:t>
             </w:r>
           </w:p>
         </w:tc>
@@ -3825,7 +3841,7 @@
               <w:rPr>
                 <w:sz w:val="18"/>
               </w:rPr>
-              <w:t>1.000 -&gt; 0.000</w:t>
+              <w:t>1.000 → 0.000</w:t>
             </w:r>
           </w:p>
         </w:tc>
@@ -3938,7 +3954,7 @@
               <w:rPr>
                 <w:sz w:val="18"/>
               </w:rPr>
-              <w:t>1.000 -&gt; 0.000</w:t>
+              <w:t>1.000 → 0.000</w:t>
             </w:r>
           </w:p>
         </w:tc>
@@ -4045,7 +4061,7 @@
               <w:rPr>
                 <w:sz w:val="18"/>
               </w:rPr>
-              <w:t>1.000 -&gt; 0.183</w:t>
+              <w:t>1.000 → 0.183</w:t>
             </w:r>
           </w:p>
         </w:tc>
@@ -4158,7 +4174,7 @@
               <w:rPr>
                 <w:sz w:val="18"/>
               </w:rPr>
-              <w:t>1.000 -&gt; 0.468</w:t>
+              <w:t>1.000 → 0.468</w:t>
             </w:r>
           </w:p>
         </w:tc>
@@ -4174,7 +4190,7 @@
           <w:color w:val="404040"/>
           <w:sz w:val="18"/>
         </w:rPr>
-        <w:t>Table 5: Junction results. The first three rows are the recorded 30-seed runs from before the two observation features were added, and they are kept as measured: that policy parked the fleet. The last row is the current checkpoint selected by completion, which departs and jams; it is a two-seed evaluation shipped as results/junction_current.csv, whose arm score is identical on both seeds (its episode is seed-invariant, so treat it as one behaviour). The 30-seed rows are seed-invariant in the same way - one distinct arm score across 30 different baselines - so their 30 of 30 means one parked or jammed behaviour beating 30 baselines, not 30 independent trials. Those rows come from results/v2_*.csv; the two are not directly comparable and are labelled accordingly.</w:t>
+        <w:t>Table 5: Junction results. The first three rows are the recorded 30-seed runs from before the two observation features were added, and they are kept as measured: that policy parked the fleet. The last row is the current checkpoint selected by completion, which departs and jams; it is a two-seed evaluation shipped as results/junction_current.csv, whose arm score is identical on both seeds (its episode is seed-invariant, so treat it as one behaviour). The 30-seed rows are seed-invariant in the same way – one distinct arm score across 30 different baselines – so their 30 of 30 means one parked or jammed behaviour beating 30 baselines, not 30 independent trials. Those rows come from results/v2_*.csv; the two are not directly comparable and are labelled accordingly.</w:t>
       </w:r>
     </w:p>
     <w:p>
@@ -4182,7 +4198,7 @@
         <w:spacing w:after="120"/>
       </w:pPr>
       <w:r>
-        <w:t>The old rows are the metric pathology in its purest form: every learned arm scores about +0.15 better than the route follower while completing 0 to 18 per cent of the trains, because a cancellation costs about 19 cost units on this map while a dispatch into the jam is charged its full delay. The current checkpoint shows the other side of the same pathology. Selected by completion rather than score, it sends every dispatched train into the throat and jams: 59 of 126 complete and the other 67 are stranded, scoring -0.2400, which is worse than the scripted baseline at -0.1823 with 126 of 126 home. Neither outcome is a working junction policy: one is gaming the metric, the other is losing to the schedule. A global controller, or imitation of the route follower, is what the map needs.</w:t>
+        <w:t>The old rows are the metric pathology in its purest form: every learned arm scores about +0.15 better than the route follower while completing 0 to 18 per cent of the trains, because a cancellation costs about 19 cost units on this map while a dispatch into the jam is charged its full delay. The current checkpoint shows the other side of the same pathology. Selected by completion rather than score, it sends every dispatched train into the throat and jams: 59 of 126 complete and the other 67 are stranded, scoring -0.2400, which is worse than the scripted baseline at -0.1823 with 126 of 126 home. Neither outcome is a working junction policy: one is gaming the metric, the other is losing to the schedule. Figure 8 sets the two behaviours side by side at step 156. A global controller, or imitation of the route follower, is what the map needs.</w:t>
       </w:r>
     </w:p>
     <w:p>
@@ -4288,7 +4304,7 @@
         <w:spacing w:after="60"/>
       </w:pPr>
       <w:r>
-        <w:t>The warm start inherits the teacher's rule, so the policy cannot beat the teacher's own score of -0.0005 (results/all_arms.md). The claim is that it reaches that local optimum, not that it exceeds it.</w:t>
+        <w:t>The warm start inherits the teacher’s rule, so the policy cannot beat the teacher’s own score of -0.0005 (results/all_arms.md). The claim is that it reaches that local optimum, not that it exceeds it.</w:t>
       </w:r>
     </w:p>
     <w:p>
@@ -4339,7 +4355,7 @@
         <w:spacing w:after="120"/>
       </w:pPr>
       <w:r>
-        <w:t>The result depended on fixing the measurement first. A train-borne failure fires when a train arrives, so a policy that reroutes suppresses the incident, and a failure placed deep inside a station's escape band leaves every follower already past the crossover. Removing the cell's transitions instead makes the blockage exogenous, keeps both arms on the same incidents, and turns the delayed condition into a genuine decision. The junction remains a loss, and its two failure modes bracket the metric's pathology: parking scores better than attempting, and attempting scores worse than the schedule.</w:t>
+        <w:t>The result depended on fixing the measurement first. A train-borne failure fires when a train arrives, so a policy that reroutes suppresses the incident, and a failure placed deep inside a station’s escape band leaves every follower already past the crossover. Removing the cell’s transitions instead makes the blockage exogenous, keeps both arms on the same incidents, and turns the delayed comparison into a genuine decision. The junction remains a loss, and its two failure modes bracket the metric’s pathology: parking scores better than attempting, and attempting scores worse than the schedule.</w:t>
       </w:r>
     </w:p>
     <w:p>
@@ -4446,7 +4462,7 @@
               <w:rPr>
                 <w:sz w:val="18"/>
               </w:rPr>
-              <w:t>Executes the notebook's cells so the CLI tools use exactly the notebook's code</w:t>
+              <w:t>Executes the notebook’s cells so the CLI tools use exactly the notebook’s code</w:t>
             </w:r>
           </w:p>
         </w:tc>
@@ -5022,7 +5038,7 @@
           <w:color w:val="404040"/>
           <w:sz w:val="18"/>
         </w:rPr>
-        <w:t>Table A1: The modules this report depends on, fifteen analysis modules plus this document's builder, out of twenty shipped scripts (eighteen analysis, two report builders). The notebook imports five directly; the rest are command-line entry points. The notebook, not the scripts, is the graded artefact.</w:t>
+        <w:t>Table A1: The modules this report depends on, fifteen analysis modules plus this document’s builder, out of twenty shipped scripts (eighteen analysis, two report builders). The notebook imports five directly; the rest are command-line entry points. The notebook, not the scripts, is the graded artefact.</w:t>
       </w:r>
     </w:p>
     <w:p>

</xml_diff>